<commit_message>
feat: Implementacion completa de servidores SOAP BanQuito y Comercializadora, BDD relativas y Manual Tecnico actualizado
</commit_message>
<xml_diff>
--- a/01. UML/01. ERS/ERS_BANQUITO_SOAP_JAVA_CONBDD_GR08.docx
+++ b/01. UML/01. ERS/ERS_BANQUITO_SOAP_JAVA_CONBDD_GR08.docx
@@ -9266,22 +9266,7 @@
         <w:jc w:val="both"/>
       </w:pPr>
       <w:r>
-        <w:rPr>
-          <w:rFonts w:ascii="Calibri" w:hAnsi="Calibri"/>
-          <w:b/>
-          <w:color w:val="000000"/>
-          <w:sz w:val="22"/>
-        </w:rPr>
-        <w:t xml:space="preserve">Módulo de Catálogo (Comercializadora):</w:t>
-      </w:r>
-      <w:r>
-        <w:rPr>
-          <w:rFonts w:ascii="Calibri" w:hAnsi="Calibri"/>
-          <w:b w:val="0"/>
-          <w:color w:val="000000"/>
-          <w:sz w:val="22"/>
-        </w:rPr>
-        <w:t xml:space="preserve"> mantenimiento de los teléfonos celulares disponibles para la venta (registro, consulta, modificación y eliminación).</w:t>
+        <w:t>Módulo de Catálogo (Comercializadora): mantenimiento integral mediante operaciones CRUD (Create, Read, Update, Delete) de los teléfonos celulares disponibles para la venta (registro, listado y consulta, modificación y eliminación física o borrado lógico).</w:t>
       </w:r>
     </w:p>
     <w:p>
@@ -12257,13 +12242,7 @@
         <w:jc w:val="both"/>
       </w:pPr>
       <w:r>
-        <w:rPr>
-          <w:rFonts w:ascii="Calibri" w:hAnsi="Calibri"/>
-          <w:b w:val="0"/>
-          <w:color w:val="000000"/>
-          <w:sz w:val="22"/>
-        </w:rPr>
-        <w:t xml:space="preserve">Mantener el catálogo de teléfonos celulares disponibles para la venta.</w:t>
+        <w:t>Mantener el catálogo de teléfonos celulares disponibles para la venta mediante operaciones CRUD completas (crear, listar, consultar por código, modificar y eliminar/desactivar).</w:t>
       </w:r>
     </w:p>
     <w:p>
@@ -19346,18 +19325,15 @@
             </w:tcMar>
           </w:tcPr>
           <w:p>
-            <w:pPr>
-              <w:spacing w:before="0" w:after="0"/>
-              <w:jc w:val="left"/>
-            </w:pPr>
-            <w:r>
-              <w:rPr>
-                <w:rFonts w:ascii="Calibri" w:hAnsi="Calibri" w:cs="Calibri"/>
-                <w:b/>
-                <w:color w:val="000000"/>
-                <w:sz w:val="19"/>
-              </w:rPr>
-              <w:t xml:space="preserve">RF-05</w:t>
+            <w:pPr/>
+            <w:r/>
+            <w:r>
+              <w:rPr>
+                <w:rFonts w:ascii="Calibri" w:hAnsi="Calibri"/>
+                <w:b w:val="0"/>
+                <w:sz w:val="19"/>
+              </w:rPr>
+              <w:t>RF-05</w:t>
             </w:r>
           </w:p>
         </w:tc>
@@ -19373,18 +19349,15 @@
             </w:tcMar>
           </w:tcPr>
           <w:p>
-            <w:pPr>
-              <w:spacing w:before="0" w:after="0"/>
-              <w:jc w:val="left"/>
-            </w:pPr>
-            <w:r>
-              <w:rPr>
-                <w:rFonts w:ascii="Calibri" w:hAnsi="Calibri" w:cs="Calibri"/>
+            <w:pPr/>
+            <w:r/>
+            <w:r>
+              <w:rPr>
+                <w:rFonts w:ascii="Calibri" w:hAnsi="Calibri"/>
                 <w:b w:val="0"/>
-                <w:color w:val="000000"/>
-                <w:sz w:val="19"/>
-              </w:rPr>
-              <w:t xml:space="preserve">El sistema debe permitir registrar, consultar, modificar y eliminar los teléfonos del catálogo.</w:t>
+                <w:sz w:val="19"/>
+              </w:rPr>
+              <w:t>El sistema debe proporcionar la funcionalidad de mantenimiento integral (CRUD: registrar, listar, consultar por ID, modificar y eliminar/desactivar lógicamente) del catálogo de teléfonos celulares.</w:t>
             </w:r>
           </w:p>
         </w:tc>
@@ -19400,18 +19373,15 @@
             </w:tcMar>
           </w:tcPr>
           <w:p>
-            <w:pPr>
-              <w:spacing w:before="0" w:after="0"/>
-              <w:jc w:val="left"/>
-            </w:pPr>
-            <w:r>
-              <w:rPr>
-                <w:rFonts w:ascii="Calibri" w:hAnsi="Calibri" w:cs="Calibri"/>
+            <w:pPr/>
+            <w:r/>
+            <w:r>
+              <w:rPr>
+                <w:rFonts w:ascii="Calibri" w:hAnsi="Calibri"/>
                 <w:b w:val="0"/>
-                <w:color w:val="000000"/>
-                <w:sz w:val="19"/>
-              </w:rPr>
-              <w:t xml:space="preserve">Mantener catálogo (CU-05)</w:t>
+                <w:sz w:val="19"/>
+              </w:rPr>
+              <w:t>Mantener catálogo (CU-05)</w:t>
             </w:r>
           </w:p>
         </w:tc>
@@ -19427,18 +19397,15 @@
             </w:tcMar>
           </w:tcPr>
           <w:p>
-            <w:pPr>
-              <w:spacing w:before="0" w:after="0"/>
-              <w:jc w:val="left"/>
-            </w:pPr>
-            <w:r>
-              <w:rPr>
-                <w:rFonts w:ascii="Calibri" w:hAnsi="Calibri" w:cs="Calibri"/>
+            <w:pPr/>
+            <w:r/>
+            <w:r>
+              <w:rPr>
+                <w:rFonts w:ascii="Calibri" w:hAnsi="Calibri"/>
                 <w:b w:val="0"/>
-                <w:color w:val="000000"/>
-                <w:sz w:val="19"/>
-              </w:rPr>
-              <w:t xml:space="preserve">Vendedor</w:t>
+                <w:sz w:val="19"/>
+              </w:rPr>
+              <w:t>Vendedor</w:t>
             </w:r>
           </w:p>
         </w:tc>
@@ -21904,76 +21871,7 @@
         </w:rPr>
       </w:pPr>
       <w:r>
-        <w:rPr>
-          <w:rFonts w:ascii="Calibri" w:hAnsi="Calibri"/>
-          <w:b/>
-          <w:color w:val="000000"/>
-          <w:sz w:val="21"/>
-        </w:rPr>
-        <w:t xml:space="preserve">Tabla </w:t>
-      </w:r>
-      <w:r>
-        <w:rPr>
-          <w:rFonts w:ascii="Calibri" w:hAnsi="Calibri"/>
-          <w:b/>
-          <w:color w:val="000000"/>
-          <w:sz w:val="21"/>
-        </w:rPr>
-        <w:fldChar w:fldCharType="begin"/>
-      </w:r>
-      <w:r>
-        <w:rPr>
-          <w:rFonts w:ascii="Calibri" w:hAnsi="Calibri"/>
-          <w:b/>
-          <w:color w:val="000000"/>
-          <w:sz w:val="21"/>
-        </w:rPr>
-        <w:instrText xml:space="preserve"> SEQ Tabla \* ARABIC </w:instrText>
-      </w:r>
-      <w:r>
-        <w:rPr>
-          <w:rFonts w:ascii="Calibri" w:hAnsi="Calibri"/>
-          <w:b/>
-          <w:color w:val="000000"/>
-          <w:sz w:val="21"/>
-        </w:rPr>
-        <w:fldChar w:fldCharType="separate"/>
-      </w:r>
-      <w:r>
-        <w:rPr>
-          <w:rFonts w:ascii="Calibri" w:hAnsi="Calibri"/>
-          <w:b/>
-          <w:color w:val="000000"/>
-          <w:sz w:val="21"/>
-        </w:rPr>
-        <w:t xml:space="preserve">19</w:t>
-      </w:r>
-      <w:r>
-        <w:rPr>
-          <w:rFonts w:ascii="Calibri" w:hAnsi="Calibri"/>
-          <w:b/>
-          <w:color w:val="000000"/>
-          <w:sz w:val="21"/>
-        </w:rPr>
-        <w:fldChar w:fldCharType="end"/>
-      </w:r>
-      <w:r>
-        <w:rPr>
-          <w:rFonts w:ascii="Calibri" w:hAnsi="Calibri"/>
-          <w:b/>
-          <w:color w:val="000000"/>
-          <w:sz w:val="21"/>
-        </w:rPr>
-        <w:t xml:space="preserve">. </w:t>
-      </w:r>
-      <w:r>
-        <w:rPr>
-          <w:rFonts w:ascii="Calibri" w:hAnsi="Calibri"/>
-          <w:b/>
-          <w:color w:val="000000"/>
-          <w:sz w:val="21"/>
-        </w:rPr>
-        <w:t xml:space="preserve">Especificación RQF-005: Mantener catálogo de celulares (CU-05)</w:t>
+        <w:t>Tabla 19. Especificación RQF-005: Mantenimiento del catálogo de celulares (CRUD)</w:t>
       </w:r>
     </w:p>
     <w:tbl>
@@ -22005,18 +21903,15 @@
             </w:tcMar>
           </w:tcPr>
           <w:p>
-            <w:pPr>
-              <w:spacing w:before="0" w:after="0"/>
-              <w:jc w:val="center"/>
-            </w:pPr>
-            <w:r>
-              <w:rPr>
-                <w:rFonts w:ascii="Calibri" w:hAnsi="Calibri" w:cs="Calibri"/>
+            <w:pPr/>
+            <w:r/>
+            <w:r>
+              <w:rPr>
+                <w:rFonts w:ascii="Calibri" w:hAnsi="Calibri"/>
                 <w:b/>
-                <w:color w:val="FFFFFF"/>
-                <w:sz w:val="19"/>
-              </w:rPr>
-              <w:t xml:space="preserve">RQF-005</w:t>
+                <w:sz w:val="19"/>
+              </w:rPr>
+              <w:t>RQF-005</w:t>
             </w:r>
           </w:p>
         </w:tc>
@@ -22032,18 +21927,15 @@
             </w:tcMar>
           </w:tcPr>
           <w:p>
-            <w:pPr>
-              <w:spacing w:before="0" w:after="0"/>
-              <w:jc w:val="left"/>
-            </w:pPr>
-            <w:r>
-              <w:rPr>
-                <w:rFonts w:ascii="Calibri" w:hAnsi="Calibri" w:cs="Calibri"/>
+            <w:pPr/>
+            <w:r/>
+            <w:r>
+              <w:rPr>
+                <w:rFonts w:ascii="Calibri" w:hAnsi="Calibri"/>
                 <w:b/>
-                <w:color w:val="FFFFFF"/>
-                <w:sz w:val="19"/>
-              </w:rPr>
-              <w:t xml:space="preserve">Mantener catálogo de celulares</w:t>
+                <w:sz w:val="19"/>
+              </w:rPr>
+              <w:t>Mantenimiento del catálogo de celulares (CRUD completo)</w:t>
             </w:r>
           </w:p>
         </w:tc>
@@ -22064,18 +21956,15 @@
             </w:tcMar>
           </w:tcPr>
           <w:p>
-            <w:pPr>
-              <w:spacing w:before="0" w:after="0"/>
-              <w:jc w:val="left"/>
-            </w:pPr>
-            <w:r>
-              <w:rPr>
-                <w:rFonts w:ascii="Calibri" w:hAnsi="Calibri" w:cs="Calibri"/>
-                <w:b/>
-                <w:color w:val="000000"/>
-                <w:sz w:val="19"/>
-              </w:rPr>
-              <w:t xml:space="preserve">Descripción</w:t>
+            <w:pPr/>
+            <w:r/>
+            <w:r>
+              <w:rPr>
+                <w:rFonts w:ascii="Calibri" w:hAnsi="Calibri"/>
+                <w:b w:val="0"/>
+                <w:sz w:val="19"/>
+              </w:rPr>
+              <w:t>Descripción</w:t>
             </w:r>
           </w:p>
         </w:tc>
@@ -22091,18 +21980,15 @@
             </w:tcMar>
           </w:tcPr>
           <w:p>
-            <w:pPr>
-              <w:spacing w:before="0" w:after="0"/>
-              <w:jc w:val="left"/>
-            </w:pPr>
-            <w:r>
-              <w:rPr>
-                <w:rFonts w:ascii="Calibri" w:hAnsi="Calibri" w:cs="Calibri"/>
+            <w:pPr/>
+            <w:r/>
+            <w:r>
+              <w:rPr>
+                <w:rFonts w:ascii="Calibri" w:hAnsi="Calibri"/>
                 <w:b w:val="0"/>
-                <w:color w:val="000000"/>
-                <w:sz w:val="19"/>
-              </w:rPr>
-              <w:t xml:space="preserve">Permite registrar, consultar, modificar y eliminar los teléfonos disponibles para la venta con su marca, modelo y precio.</w:t>
+                <w:sz w:val="19"/>
+              </w:rPr>
+              <w:t>Permite al vendedor administrar el catálogo mediante operaciones CRUD: registrar nuevos teléfonos (Create), listar teléfonos activos y consultar por código (Read), modificar datos o reactivar/desactivar (Update) y eliminar o aplicar borrado lógico (Delete) conservando marca, modelo y precio.</w:t>
             </w:r>
           </w:p>
         </w:tc>
@@ -22123,18 +22009,15 @@
             </w:tcMar>
           </w:tcPr>
           <w:p>
-            <w:pPr>
-              <w:spacing w:before="0" w:after="0"/>
-              <w:jc w:val="left"/>
-            </w:pPr>
-            <w:r>
-              <w:rPr>
-                <w:rFonts w:ascii="Calibri" w:hAnsi="Calibri" w:cs="Calibri"/>
-                <w:b/>
-                <w:color w:val="000000"/>
-                <w:sz w:val="19"/>
-              </w:rPr>
-              <w:t xml:space="preserve">Objetivo</w:t>
+            <w:pPr/>
+            <w:r/>
+            <w:r>
+              <w:rPr>
+                <w:rFonts w:ascii="Calibri" w:hAnsi="Calibri"/>
+                <w:b w:val="0"/>
+                <w:sz w:val="19"/>
+              </w:rPr>
+              <w:t>Objetivo</w:t>
             </w:r>
           </w:p>
         </w:tc>
@@ -22150,18 +22033,15 @@
             </w:tcMar>
           </w:tcPr>
           <w:p>
-            <w:pPr>
-              <w:spacing w:before="0" w:after="0"/>
-              <w:jc w:val="left"/>
-            </w:pPr>
-            <w:r>
-              <w:rPr>
-                <w:rFonts w:ascii="Calibri" w:hAnsi="Calibri" w:cs="Calibri"/>
+            <w:pPr/>
+            <w:r/>
+            <w:r>
+              <w:rPr>
+                <w:rFonts w:ascii="Calibri" w:hAnsi="Calibri"/>
                 <w:b w:val="0"/>
-                <w:color w:val="000000"/>
-                <w:sz w:val="19"/>
-              </w:rPr>
-              <w:t xml:space="preserve">OBJ-003</w:t>
+                <w:sz w:val="19"/>
+              </w:rPr>
+              <w:t>OBJ-003</w:t>
             </w:r>
           </w:p>
         </w:tc>
@@ -22182,18 +22062,15 @@
             </w:tcMar>
           </w:tcPr>
           <w:p>
-            <w:pPr>
-              <w:spacing w:before="0" w:after="0"/>
-              <w:jc w:val="left"/>
-            </w:pPr>
-            <w:r>
-              <w:rPr>
-                <w:rFonts w:ascii="Calibri" w:hAnsi="Calibri" w:cs="Calibri"/>
-                <w:b/>
-                <w:color w:val="000000"/>
-                <w:sz w:val="19"/>
-              </w:rPr>
-              <w:t xml:space="preserve">Importancia</w:t>
+            <w:pPr/>
+            <w:r/>
+            <w:r>
+              <w:rPr>
+                <w:rFonts w:ascii="Calibri" w:hAnsi="Calibri"/>
+                <w:b w:val="0"/>
+                <w:sz w:val="19"/>
+              </w:rPr>
+              <w:t>Importancia</w:t>
             </w:r>
           </w:p>
         </w:tc>
@@ -22209,18 +22086,15 @@
             </w:tcMar>
           </w:tcPr>
           <w:p>
-            <w:pPr>
-              <w:spacing w:before="0" w:after="0"/>
-              <w:jc w:val="left"/>
-            </w:pPr>
-            <w:r>
-              <w:rPr>
-                <w:rFonts w:ascii="Calibri" w:hAnsi="Calibri" w:cs="Calibri"/>
+            <w:pPr/>
+            <w:r/>
+            <w:r>
+              <w:rPr>
+                <w:rFonts w:ascii="Calibri" w:hAnsi="Calibri"/>
                 <w:b w:val="0"/>
-                <w:color w:val="000000"/>
-                <w:sz w:val="19"/>
-              </w:rPr>
-              <w:t xml:space="preserve">Media</w:t>
+                <w:sz w:val="19"/>
+              </w:rPr>
+              <w:t>Alta</w:t>
             </w:r>
           </w:p>
         </w:tc>
@@ -22241,18 +22115,15 @@
             </w:tcMar>
           </w:tcPr>
           <w:p>
-            <w:pPr>
-              <w:spacing w:before="0" w:after="0"/>
-              <w:jc w:val="left"/>
-            </w:pPr>
-            <w:r>
-              <w:rPr>
-                <w:rFonts w:ascii="Calibri" w:hAnsi="Calibri" w:cs="Calibri"/>
-                <w:b/>
-                <w:color w:val="000000"/>
-                <w:sz w:val="19"/>
-              </w:rPr>
-              <w:t xml:space="preserve">Estado</w:t>
+            <w:pPr/>
+            <w:r/>
+            <w:r>
+              <w:rPr>
+                <w:rFonts w:ascii="Calibri" w:hAnsi="Calibri"/>
+                <w:b w:val="0"/>
+                <w:sz w:val="19"/>
+              </w:rPr>
+              <w:t>Estado</w:t>
             </w:r>
           </w:p>
         </w:tc>
@@ -22268,18 +22139,15 @@
             </w:tcMar>
           </w:tcPr>
           <w:p>
-            <w:pPr>
-              <w:spacing w:before="0" w:after="0"/>
-              <w:jc w:val="left"/>
-            </w:pPr>
-            <w:r>
-              <w:rPr>
-                <w:rFonts w:ascii="Calibri" w:hAnsi="Calibri" w:cs="Calibri"/>
+            <w:pPr/>
+            <w:r/>
+            <w:r>
+              <w:rPr>
+                <w:rFonts w:ascii="Calibri" w:hAnsi="Calibri"/>
                 <w:b w:val="0"/>
-                <w:color w:val="000000"/>
-                <w:sz w:val="19"/>
-              </w:rPr>
-              <w:t xml:space="preserve">Aprobado</w:t>
+                <w:sz w:val="19"/>
+              </w:rPr>
+              <w:t>Aprobado</w:t>
             </w:r>
           </w:p>
         </w:tc>
@@ -22300,18 +22168,15 @@
             </w:tcMar>
           </w:tcPr>
           <w:p>
-            <w:pPr>
-              <w:spacing w:before="0" w:after="0"/>
-              <w:jc w:val="left"/>
-            </w:pPr>
-            <w:r>
-              <w:rPr>
-                <w:rFonts w:ascii="Calibri" w:hAnsi="Calibri" w:cs="Calibri"/>
-                <w:b/>
-                <w:color w:val="000000"/>
-                <w:sz w:val="19"/>
-              </w:rPr>
-              <w:t xml:space="preserve">Estabilidad</w:t>
+            <w:pPr/>
+            <w:r/>
+            <w:r>
+              <w:rPr>
+                <w:rFonts w:ascii="Calibri" w:hAnsi="Calibri"/>
+                <w:b w:val="0"/>
+                <w:sz w:val="19"/>
+              </w:rPr>
+              <w:t>Estabilidad</w:t>
             </w:r>
           </w:p>
         </w:tc>
@@ -22327,18 +22192,15 @@
             </w:tcMar>
           </w:tcPr>
           <w:p>
-            <w:pPr>
-              <w:spacing w:before="0" w:after="0"/>
-              <w:jc w:val="left"/>
-            </w:pPr>
-            <w:r>
-              <w:rPr>
-                <w:rFonts w:ascii="Calibri" w:hAnsi="Calibri" w:cs="Calibri"/>
+            <w:pPr/>
+            <w:r/>
+            <w:r>
+              <w:rPr>
+                <w:rFonts w:ascii="Calibri" w:hAnsi="Calibri"/>
                 <w:b w:val="0"/>
-                <w:color w:val="000000"/>
-                <w:sz w:val="19"/>
-              </w:rPr>
-              <w:t xml:space="preserve">Alta</w:t>
+                <w:sz w:val="19"/>
+              </w:rPr>
+              <w:t>Alta</w:t>
             </w:r>
           </w:p>
         </w:tc>
@@ -22359,18 +22221,15 @@
             </w:tcMar>
           </w:tcPr>
           <w:p>
-            <w:pPr>
-              <w:spacing w:before="0" w:after="0"/>
-              <w:jc w:val="left"/>
-            </w:pPr>
-            <w:r>
-              <w:rPr>
-                <w:rFonts w:ascii="Calibri" w:hAnsi="Calibri" w:cs="Calibri"/>
-                <w:b/>
-                <w:color w:val="000000"/>
-                <w:sz w:val="19"/>
-              </w:rPr>
-              <w:t xml:space="preserve">Comentarios</w:t>
+            <w:pPr/>
+            <w:r/>
+            <w:r>
+              <w:rPr>
+                <w:rFonts w:ascii="Calibri" w:hAnsi="Calibri"/>
+                <w:b w:val="0"/>
+                <w:sz w:val="19"/>
+              </w:rPr>
+              <w:t>Comentarios</w:t>
             </w:r>
           </w:p>
         </w:tc>
@@ -22386,18 +22245,15 @@
             </w:tcMar>
           </w:tcPr>
           <w:p>
-            <w:pPr>
-              <w:spacing w:before="0" w:after="0"/>
-              <w:jc w:val="left"/>
-            </w:pPr>
-            <w:r>
-              <w:rPr>
-                <w:rFonts w:ascii="Calibri" w:hAnsi="Calibri" w:cs="Calibri"/>
+            <w:pPr/>
+            <w:r/>
+            <w:r>
+              <w:rPr>
+                <w:rFonts w:ascii="Calibri" w:hAnsi="Calibri"/>
                 <w:b w:val="0"/>
-                <w:color w:val="000000"/>
-                <w:sz w:val="19"/>
-              </w:rPr>
-              <w:t xml:space="preserve">No se controla inventario. Un teléfono con facturas asociadas se desactiva en lugar de eliminarse.</w:t>
+                <w:sz w:val="19"/>
+              </w:rPr>
+              <w:t>No se controla inventario. Si el teléfono posee facturas asociadas en DETALLE_FACTURA, se aplica borrado lógico (activo = 0) para mantener la integridad referencial; si no tiene ventas registradas, se permite la eliminación física del registro.</w:t>
             </w:r>
           </w:p>
         </w:tc>
@@ -29129,18 +28985,15 @@
             </w:tcMar>
           </w:tcPr>
           <w:p>
-            <w:pPr>
-              <w:spacing w:before="0" w:after="0"/>
-              <w:jc w:val="left"/>
-            </w:pPr>
-            <w:r>
-              <w:rPr>
-                <w:rFonts w:ascii="Calibri" w:hAnsi="Calibri" w:cs="Calibri"/>
-                <w:b/>
-                <w:color w:val="000000"/>
-                <w:sz w:val="19"/>
-              </w:rPr>
-              <w:t xml:space="preserve">listarCelulares</w:t>
+            <w:pPr/>
+            <w:r/>
+            <w:r>
+              <w:rPr>
+                <w:rFonts w:ascii="Calibri" w:hAnsi="Calibri"/>
+                <w:b w:val="0"/>
+                <w:sz w:val="19"/>
+              </w:rPr>
+              <w:t>crearCelular</w:t>
             </w:r>
           </w:p>
         </w:tc>
@@ -29156,18 +29009,15 @@
             </w:tcMar>
           </w:tcPr>
           <w:p>
-            <w:pPr>
-              <w:spacing w:before="0" w:after="0"/>
-              <w:jc w:val="left"/>
-            </w:pPr>
-            <w:r>
-              <w:rPr>
-                <w:rFonts w:ascii="Calibri" w:hAnsi="Calibri" w:cs="Calibri"/>
+            <w:pPr/>
+            <w:r/>
+            <w:r>
+              <w:rPr>
+                <w:rFonts w:ascii="Calibri" w:hAnsi="Calibri"/>
                 <w:b w:val="0"/>
-                <w:color w:val="000000"/>
-                <w:sz w:val="19"/>
-              </w:rPr>
-              <w:t xml:space="preserve">—</w:t>
+                <w:sz w:val="19"/>
+              </w:rPr>
+              <w:t>String marca, String modelo, BigDecimal precio</w:t>
             </w:r>
           </w:p>
         </w:tc>
@@ -29183,18 +29033,15 @@
             </w:tcMar>
           </w:tcPr>
           <w:p>
-            <w:pPr>
-              <w:spacing w:before="0" w:after="0"/>
-              <w:jc w:val="left"/>
-            </w:pPr>
-            <w:r>
-              <w:rPr>
-                <w:rFonts w:ascii="Calibri" w:hAnsi="Calibri" w:cs="Calibri"/>
+            <w:pPr/>
+            <w:r/>
+            <w:r>
+              <w:rPr>
+                <w:rFonts w:ascii="Calibri" w:hAnsi="Calibri"/>
                 <w:b w:val="0"/>
-                <w:color w:val="000000"/>
-                <w:sz w:val="19"/>
-              </w:rPr>
-              <w:t xml:space="preserve">List&lt;Celular&gt;</w:t>
+                <w:sz w:val="19"/>
+              </w:rPr>
+              <w:t>Celular</w:t>
             </w:r>
           </w:p>
         </w:tc>
@@ -29210,18 +29057,15 @@
             </w:tcMar>
           </w:tcPr>
           <w:p>
-            <w:pPr>
-              <w:spacing w:before="0" w:after="0"/>
-              <w:jc w:val="left"/>
-            </w:pPr>
-            <w:r>
-              <w:rPr>
-                <w:rFonts w:ascii="Calibri" w:hAnsi="Calibri" w:cs="Calibri"/>
+            <w:pPr/>
+            <w:r/>
+            <w:r>
+              <w:rPr>
+                <w:rFonts w:ascii="Calibri" w:hAnsi="Calibri"/>
                 <w:b w:val="0"/>
-                <w:color w:val="000000"/>
-                <w:sz w:val="19"/>
-              </w:rPr>
-              <w:t xml:space="preserve">Retorna el catálogo de teléfonos disponibles.</w:t>
+                <w:sz w:val="19"/>
+              </w:rPr>
+              <w:t>Operación Create (C): registra un nuevo celular disponible en el catálogo con estado activo.</w:t>
             </w:r>
           </w:p>
         </w:tc>
@@ -29242,18 +29086,15 @@
             </w:tcMar>
           </w:tcPr>
           <w:p>
-            <w:pPr>
-              <w:spacing w:before="0" w:after="0"/>
-              <w:jc w:val="left"/>
-            </w:pPr>
-            <w:r>
-              <w:rPr>
-                <w:rFonts w:ascii="Calibri" w:hAnsi="Calibri" w:cs="Calibri"/>
-                <w:b/>
-                <w:color w:val="000000"/>
-                <w:sz w:val="19"/>
-              </w:rPr>
-              <w:t xml:space="preserve">guardarCelular</w:t>
+            <w:pPr/>
+            <w:r/>
+            <w:r>
+              <w:rPr>
+                <w:rFonts w:ascii="Calibri" w:hAnsi="Calibri"/>
+                <w:b w:val="0"/>
+                <w:sz w:val="19"/>
+              </w:rPr>
+              <w:t>listarCelulares</w:t>
             </w:r>
           </w:p>
         </w:tc>
@@ -29269,18 +29110,15 @@
             </w:tcMar>
           </w:tcPr>
           <w:p>
-            <w:pPr>
-              <w:spacing w:before="0" w:after="0"/>
-              <w:jc w:val="left"/>
-            </w:pPr>
-            <w:r>
-              <w:rPr>
-                <w:rFonts w:ascii="Calibri" w:hAnsi="Calibri" w:cs="Calibri"/>
+            <w:pPr/>
+            <w:r/>
+            <w:r>
+              <w:rPr>
+                <w:rFonts w:ascii="Calibri" w:hAnsi="Calibri"/>
                 <w:b w:val="0"/>
-                <w:color w:val="000000"/>
-                <w:sz w:val="19"/>
-              </w:rPr>
-              <w:t xml:space="preserve">Celular celular</w:t>
+                <w:sz w:val="19"/>
+              </w:rPr>
+              <w:t>—</w:t>
             </w:r>
           </w:p>
         </w:tc>
@@ -29296,18 +29134,15 @@
             </w:tcMar>
           </w:tcPr>
           <w:p>
-            <w:pPr>
-              <w:spacing w:before="0" w:after="0"/>
-              <w:jc w:val="left"/>
-            </w:pPr>
-            <w:r>
-              <w:rPr>
-                <w:rFonts w:ascii="Calibri" w:hAnsi="Calibri" w:cs="Calibri"/>
+            <w:pPr/>
+            <w:r/>
+            <w:r>
+              <w:rPr>
+                <w:rFonts w:ascii="Calibri" w:hAnsi="Calibri"/>
                 <w:b w:val="0"/>
-                <w:color w:val="000000"/>
-                <w:sz w:val="19"/>
-              </w:rPr>
-              <w:t xml:space="preserve">Celular</w:t>
+                <w:sz w:val="19"/>
+              </w:rPr>
+              <w:t>List&lt;Celular&gt;</w:t>
             </w:r>
           </w:p>
         </w:tc>
@@ -29323,18 +29158,15 @@
             </w:tcMar>
           </w:tcPr>
           <w:p>
-            <w:pPr>
-              <w:spacing w:before="0" w:after="0"/>
-              <w:jc w:val="left"/>
-            </w:pPr>
-            <w:r>
-              <w:rPr>
-                <w:rFonts w:ascii="Calibri" w:hAnsi="Calibri" w:cs="Calibri"/>
+            <w:pPr/>
+            <w:r/>
+            <w:r>
+              <w:rPr>
+                <w:rFonts w:ascii="Calibri" w:hAnsi="Calibri"/>
                 <w:b w:val="0"/>
-                <w:color w:val="000000"/>
-                <w:sz w:val="19"/>
-              </w:rPr>
-              <w:t xml:space="preserve">Registra o modifica un teléfono del catálogo.</w:t>
+                <w:sz w:val="19"/>
+              </w:rPr>
+              <w:t>Operación Read (R): retorna la lista de todos los teléfonos celulares activos en el catálogo.</w:t>
             </w:r>
           </w:p>
         </w:tc>
@@ -29355,18 +29187,15 @@
             </w:tcMar>
           </w:tcPr>
           <w:p>
-            <w:pPr>
-              <w:spacing w:before="0" w:after="0"/>
-              <w:jc w:val="left"/>
-            </w:pPr>
-            <w:r>
-              <w:rPr>
-                <w:rFonts w:ascii="Calibri" w:hAnsi="Calibri" w:cs="Calibri"/>
-                <w:b/>
-                <w:color w:val="000000"/>
-                <w:sz w:val="19"/>
-              </w:rPr>
-              <w:t xml:space="preserve">eliminarCelular</w:t>
+            <w:pPr/>
+            <w:r/>
+            <w:r>
+              <w:rPr>
+                <w:rFonts w:ascii="Calibri" w:hAnsi="Calibri"/>
+                <w:b w:val="0"/>
+                <w:sz w:val="19"/>
+              </w:rPr>
+              <w:t>obtenerCelular</w:t>
             </w:r>
           </w:p>
         </w:tc>
@@ -29382,18 +29211,15 @@
             </w:tcMar>
           </w:tcPr>
           <w:p>
-            <w:pPr>
-              <w:spacing w:before="0" w:after="0"/>
-              <w:jc w:val="left"/>
-            </w:pPr>
-            <w:r>
-              <w:rPr>
-                <w:rFonts w:ascii="Calibri" w:hAnsi="Calibri" w:cs="Calibri"/>
+            <w:pPr/>
+            <w:r/>
+            <w:r>
+              <w:rPr>
+                <w:rFonts w:ascii="Calibri" w:hAnsi="Calibri"/>
                 <w:b w:val="0"/>
-                <w:color w:val="000000"/>
-                <w:sz w:val="19"/>
-              </w:rPr>
-              <w:t xml:space="preserve">int codCelular</w:t>
+                <w:sz w:val="19"/>
+              </w:rPr>
+              <w:t>int codCelular</w:t>
             </w:r>
           </w:p>
         </w:tc>
@@ -29409,18 +29235,15 @@
             </w:tcMar>
           </w:tcPr>
           <w:p>
-            <w:pPr>
-              <w:spacing w:before="0" w:after="0"/>
-              <w:jc w:val="left"/>
-            </w:pPr>
-            <w:r>
-              <w:rPr>
-                <w:rFonts w:ascii="Calibri" w:hAnsi="Calibri" w:cs="Calibri"/>
+            <w:pPr/>
+            <w:r/>
+            <w:r>
+              <w:rPr>
+                <w:rFonts w:ascii="Calibri" w:hAnsi="Calibri"/>
                 <w:b w:val="0"/>
-                <w:color w:val="000000"/>
-                <w:sz w:val="19"/>
-              </w:rPr>
-              <w:t xml:space="preserve">boolean</w:t>
+                <w:sz w:val="19"/>
+              </w:rPr>
+              <w:t>Celular</w:t>
             </w:r>
           </w:p>
         </w:tc>
@@ -29436,18 +29259,15 @@
             </w:tcMar>
           </w:tcPr>
           <w:p>
-            <w:pPr>
-              <w:spacing w:before="0" w:after="0"/>
-              <w:jc w:val="left"/>
-            </w:pPr>
-            <w:r>
-              <w:rPr>
-                <w:rFonts w:ascii="Calibri" w:hAnsi="Calibri" w:cs="Calibri"/>
+            <w:pPr/>
+            <w:r/>
+            <w:r>
+              <w:rPr>
+                <w:rFonts w:ascii="Calibri" w:hAnsi="Calibri"/>
                 <w:b w:val="0"/>
-                <w:color w:val="000000"/>
-                <w:sz w:val="19"/>
-              </w:rPr>
-              <w:t xml:space="preserve">Elimina o desactiva un teléfono del catálogo.</w:t>
+                <w:sz w:val="19"/>
+              </w:rPr>
+              <w:t>Operación Read (R): busca y retorna el detalle de un teléfono celular específico por su código.</w:t>
             </w:r>
           </w:p>
         </w:tc>
@@ -29468,18 +29288,15 @@
             </w:tcMar>
           </w:tcPr>
           <w:p>
-            <w:pPr>
-              <w:spacing w:before="0" w:after="0"/>
-              <w:jc w:val="left"/>
-            </w:pPr>
-            <w:r>
-              <w:rPr>
-                <w:rFonts w:ascii="Calibri" w:hAnsi="Calibri" w:cs="Calibri"/>
-                <w:b/>
-                <w:color w:val="000000"/>
-                <w:sz w:val="19"/>
-              </w:rPr>
-              <w:t xml:space="preserve">facturarEfectivo</w:t>
+            <w:pPr/>
+            <w:r/>
+            <w:r>
+              <w:rPr>
+                <w:rFonts w:ascii="Calibri" w:hAnsi="Calibri"/>
+                <w:b w:val="0"/>
+                <w:sz w:val="19"/>
+              </w:rPr>
+              <w:t>actualizarCelular</w:t>
             </w:r>
           </w:p>
         </w:tc>
@@ -29495,18 +29312,15 @@
             </w:tcMar>
           </w:tcPr>
           <w:p>
-            <w:pPr>
-              <w:spacing w:before="0" w:after="0"/>
-              <w:jc w:val="left"/>
-            </w:pPr>
-            <w:r>
-              <w:rPr>
-                <w:rFonts w:ascii="Calibri" w:hAnsi="Calibri" w:cs="Calibri"/>
+            <w:pPr/>
+            <w:r/>
+            <w:r>
+              <w:rPr>
+                <w:rFonts w:ascii="Calibri" w:hAnsi="Calibri"/>
                 <w:b w:val="0"/>
-                <w:color w:val="000000"/>
-                <w:sz w:val="19"/>
-              </w:rPr>
-              <w:t xml:space="preserve">String cedula, String nombre, int codCelular</w:t>
+                <w:sz w:val="19"/>
+              </w:rPr>
+              <w:t>int codCelular, String marca, String modelo, BigDecimal precio, boolean activo</w:t>
             </w:r>
           </w:p>
         </w:tc>
@@ -29522,18 +29336,15 @@
             </w:tcMar>
           </w:tcPr>
           <w:p>
-            <w:pPr>
-              <w:spacing w:before="0" w:after="0"/>
-              <w:jc w:val="left"/>
-            </w:pPr>
-            <w:r>
-              <w:rPr>
-                <w:rFonts w:ascii="Calibri" w:hAnsi="Calibri" w:cs="Calibri"/>
+            <w:pPr/>
+            <w:r/>
+            <w:r>
+              <w:rPr>
+                <w:rFonts w:ascii="Calibri" w:hAnsi="Calibri"/>
                 <w:b w:val="0"/>
-                <w:color w:val="000000"/>
-                <w:sz w:val="19"/>
-              </w:rPr>
-              <w:t xml:space="preserve">Factura</w:t>
+                <w:sz w:val="19"/>
+              </w:rPr>
+              <w:t>Celular</w:t>
             </w:r>
           </w:p>
         </w:tc>
@@ -29549,18 +29360,15 @@
             </w:tcMar>
           </w:tcPr>
           <w:p>
-            <w:pPr>
-              <w:spacing w:before="0" w:after="0"/>
-              <w:jc w:val="left"/>
-            </w:pPr>
-            <w:r>
-              <w:rPr>
-                <w:rFonts w:ascii="Calibri" w:hAnsi="Calibri" w:cs="Calibri"/>
+            <w:pPr/>
+            <w:r/>
+            <w:r>
+              <w:rPr>
+                <w:rFonts w:ascii="Calibri" w:hAnsi="Calibri"/>
                 <w:b w:val="0"/>
-                <w:color w:val="000000"/>
-                <w:sz w:val="19"/>
-              </w:rPr>
-              <w:t xml:space="preserve">Factura con descuento del 42 %.</w:t>
+                <w:sz w:val="19"/>
+              </w:rPr>
+              <w:t>Operación Update (U): modifica los datos o estado de un celular del catálogo.</w:t>
             </w:r>
           </w:p>
         </w:tc>
@@ -29581,18 +29389,15 @@
             </w:tcMar>
           </w:tcPr>
           <w:p>
-            <w:pPr>
-              <w:spacing w:before="0" w:after="0"/>
-              <w:jc w:val="left"/>
-            </w:pPr>
-            <w:r>
-              <w:rPr>
-                <w:rFonts w:ascii="Calibri" w:hAnsi="Calibri" w:cs="Calibri"/>
-                <w:b/>
-                <w:color w:val="000000"/>
-                <w:sz w:val="19"/>
-              </w:rPr>
-              <w:t xml:space="preserve">facturarCredito</w:t>
+            <w:pPr/>
+            <w:r/>
+            <w:r>
+              <w:rPr>
+                <w:rFonts w:ascii="Calibri" w:hAnsi="Calibri"/>
+                <w:b w:val="0"/>
+                <w:sz w:val="19"/>
+              </w:rPr>
+              <w:t>eliminarCelular</w:t>
             </w:r>
           </w:p>
         </w:tc>
@@ -29608,18 +29413,15 @@
             </w:tcMar>
           </w:tcPr>
           <w:p>
-            <w:pPr>
-              <w:spacing w:before="0" w:after="0"/>
-              <w:jc w:val="left"/>
-            </w:pPr>
-            <w:r>
-              <w:rPr>
-                <w:rFonts w:ascii="Calibri" w:hAnsi="Calibri" w:cs="Calibri"/>
+            <w:pPr/>
+            <w:r/>
+            <w:r>
+              <w:rPr>
+                <w:rFonts w:ascii="Calibri" w:hAnsi="Calibri"/>
                 <w:b w:val="0"/>
-                <w:color w:val="000000"/>
-                <w:sz w:val="19"/>
-              </w:rPr>
-              <w:t xml:space="preserve">String cedula, String nombre, int codCelular, int numeroCuotas</w:t>
+                <w:sz w:val="19"/>
+              </w:rPr>
+              <w:t>int codCelular</w:t>
             </w:r>
           </w:p>
         </w:tc>
@@ -29635,18 +29437,15 @@
             </w:tcMar>
           </w:tcPr>
           <w:p>
-            <w:pPr>
-              <w:spacing w:before="0" w:after="0"/>
-              <w:jc w:val="left"/>
-            </w:pPr>
-            <w:r>
-              <w:rPr>
-                <w:rFonts w:ascii="Calibri" w:hAnsi="Calibri" w:cs="Calibri"/>
+            <w:pPr/>
+            <w:r/>
+            <w:r>
+              <w:rPr>
+                <w:rFonts w:ascii="Calibri" w:hAnsi="Calibri"/>
                 <w:b w:val="0"/>
-                <w:color w:val="000000"/>
-                <w:sz w:val="19"/>
-              </w:rPr>
-              <w:t xml:space="preserve">Factura</w:t>
+                <w:sz w:val="19"/>
+              </w:rPr>
+              <w:t>boolean</w:t>
             </w:r>
           </w:p>
         </w:tc>
@@ -29662,18 +29461,15 @@
             </w:tcMar>
           </w:tcPr>
           <w:p>
-            <w:pPr>
-              <w:spacing w:before="0" w:after="0"/>
-              <w:jc w:val="left"/>
-            </w:pPr>
-            <w:r>
-              <w:rPr>
-                <w:rFonts w:ascii="Calibri" w:hAnsi="Calibri" w:cs="Calibri"/>
+            <w:pPr/>
+            <w:r/>
+            <w:r>
+              <w:rPr>
+                <w:rFonts w:ascii="Calibri" w:hAnsi="Calibri"/>
                 <w:b w:val="0"/>
-                <w:color w:val="000000"/>
-                <w:sz w:val="19"/>
-              </w:rPr>
-              <w:t xml:space="preserve">Invoca al Core y factura si el crédito es aprobado.</w:t>
+                <w:sz w:val="19"/>
+              </w:rPr>
+              <w:t>Operación Delete (D): elimina físicamente si no tiene facturas, o aplica borrado lógico (activo = 0) si tiene ventas asociadas.</w:t>
             </w:r>
           </w:p>
         </w:tc>
@@ -29694,18 +29490,15 @@
             </w:tcMar>
           </w:tcPr>
           <w:p>
-            <w:pPr>
-              <w:spacing w:before="0" w:after="0"/>
-              <w:jc w:val="left"/>
-            </w:pPr>
-            <w:r>
-              <w:rPr>
-                <w:rFonts w:ascii="Calibri" w:hAnsi="Calibri" w:cs="Calibri"/>
-                <w:b/>
-                <w:color w:val="000000"/>
-                <w:sz w:val="19"/>
-              </w:rPr>
-              <w:t xml:space="preserve">consultarAmortizacion</w:t>
+            <w:pPr/>
+            <w:r/>
+            <w:r>
+              <w:rPr>
+                <w:rFonts w:ascii="Calibri" w:hAnsi="Calibri"/>
+                <w:b w:val="0"/>
+                <w:sz w:val="19"/>
+              </w:rPr>
+              <w:t>facturarEfectivo</w:t>
             </w:r>
           </w:p>
         </w:tc>
@@ -29721,18 +29514,15 @@
             </w:tcMar>
           </w:tcPr>
           <w:p>
-            <w:pPr>
-              <w:spacing w:before="0" w:after="0"/>
-              <w:jc w:val="left"/>
-            </w:pPr>
-            <w:r>
-              <w:rPr>
-                <w:rFonts w:ascii="Calibri" w:hAnsi="Calibri" w:cs="Calibri"/>
+            <w:pPr/>
+            <w:r/>
+            <w:r>
+              <w:rPr>
+                <w:rFonts w:ascii="Calibri" w:hAnsi="Calibri"/>
                 <w:b w:val="0"/>
-                <w:color w:val="000000"/>
-                <w:sz w:val="19"/>
-              </w:rPr>
-              <w:t xml:space="preserve">int numFactura</w:t>
+                <w:sz w:val="19"/>
+              </w:rPr>
+              <w:t>String cedula, String nombre, int codCelular</w:t>
             </w:r>
           </w:p>
         </w:tc>
@@ -29748,18 +29538,15 @@
             </w:tcMar>
           </w:tcPr>
           <w:p>
-            <w:pPr>
-              <w:spacing w:before="0" w:after="0"/>
-              <w:jc w:val="left"/>
-            </w:pPr>
-            <w:r>
-              <w:rPr>
-                <w:rFonts w:ascii="Calibri" w:hAnsi="Calibri" w:cs="Calibri"/>
+            <w:pPr/>
+            <w:r/>
+            <w:r>
+              <w:rPr>
+                <w:rFonts w:ascii="Calibri" w:hAnsi="Calibri"/>
                 <w:b w:val="0"/>
-                <w:color w:val="000000"/>
-                <w:sz w:val="19"/>
-              </w:rPr>
-              <w:t xml:space="preserve">List&lt;CuotaAmortizacion&gt;</w:t>
+                <w:sz w:val="19"/>
+              </w:rPr>
+              <w:t>Factura</w:t>
             </w:r>
           </w:p>
         </w:tc>
@@ -29775,18 +29562,225 @@
             </w:tcMar>
           </w:tcPr>
           <w:p>
-            <w:pPr>
-              <w:spacing w:before="0" w:after="0"/>
-              <w:jc w:val="left"/>
-            </w:pPr>
-            <w:r>
-              <w:rPr>
-                <w:rFonts w:ascii="Calibri" w:hAnsi="Calibri" w:cs="Calibri"/>
+            <w:pPr/>
+            <w:r/>
+            <w:r>
+              <w:rPr>
+                <w:rFonts w:ascii="Calibri" w:hAnsi="Calibri"/>
                 <w:b w:val="0"/>
-                <w:color w:val="000000"/>
-                <w:sz w:val="19"/>
-              </w:rPr>
-              <w:t xml:space="preserve">Obtiene del Core la tabla del crédito de la factura.</w:t>
+                <w:sz w:val="19"/>
+              </w:rPr>
+              <w:t>Registra la venta con pago en efectivo aplicando un 42 % de descuento sobre el precio de lista (Create).</w:t>
+            </w:r>
+          </w:p>
+        </w:tc>
+      </w:tr>
+      <w:tr>
+        <w:tc>
+          <w:tcPr>
+            <w:tcW w:type="dxa" w:w="2260"/>
+          </w:tcPr>
+          <w:p>
+            <w:pPr/>
+            <w:r/>
+            <w:r>
+              <w:rPr>
+                <w:rFonts w:ascii="Calibri" w:hAnsi="Calibri"/>
+                <w:b w:val="0"/>
+                <w:sz w:val="19"/>
+              </w:rPr>
+              <w:t>facturarCredito</w:t>
+            </w:r>
+          </w:p>
+        </w:tc>
+        <w:tc>
+          <w:tcPr>
+            <w:tcW w:type="dxa" w:w="2826"/>
+          </w:tcPr>
+          <w:p>
+            <w:pPr/>
+            <w:r/>
+            <w:r>
+              <w:rPr>
+                <w:rFonts w:ascii="Calibri" w:hAnsi="Calibri"/>
+                <w:b w:val="0"/>
+                <w:sz w:val="19"/>
+              </w:rPr>
+              <w:t>String cedula, String nombre, int codCelular, int numeroCuotas</w:t>
+            </w:r>
+          </w:p>
+        </w:tc>
+        <w:tc>
+          <w:tcPr>
+            <w:tcW w:type="dxa" w:w="1884"/>
+          </w:tcPr>
+          <w:p>
+            <w:pPr/>
+            <w:r/>
+            <w:r>
+              <w:rPr>
+                <w:rFonts w:ascii="Calibri" w:hAnsi="Calibri"/>
+                <w:b w:val="0"/>
+                <w:sz w:val="19"/>
+              </w:rPr>
+              <w:t>Factura</w:t>
+            </w:r>
+          </w:p>
+        </w:tc>
+        <w:tc>
+          <w:tcPr>
+            <w:tcW w:type="dxa" w:w="2450"/>
+          </w:tcPr>
+          <w:p>
+            <w:pPr/>
+            <w:r/>
+            <w:r>
+              <w:rPr>
+                <w:rFonts w:ascii="Calibri" w:hAnsi="Calibri"/>
+                <w:b w:val="0"/>
+                <w:sz w:val="19"/>
+              </w:rPr>
+              <w:t>Invoca al Core BanQuito, evalúa sujeto y monto máximo, y factura con crédito aprobado (Create).</w:t>
+            </w:r>
+          </w:p>
+        </w:tc>
+      </w:tr>
+      <w:tr>
+        <w:tc>
+          <w:tcPr>
+            <w:tcW w:type="dxa" w:w="2260"/>
+          </w:tcPr>
+          <w:p>
+            <w:pPr/>
+            <w:r/>
+            <w:r>
+              <w:rPr>
+                <w:rFonts w:ascii="Calibri" w:hAnsi="Calibri"/>
+                <w:b w:val="0"/>
+                <w:sz w:val="19"/>
+              </w:rPr>
+              <w:t>consultarAmortizacion</w:t>
+            </w:r>
+          </w:p>
+        </w:tc>
+        <w:tc>
+          <w:tcPr>
+            <w:tcW w:type="dxa" w:w="2826"/>
+          </w:tcPr>
+          <w:p>
+            <w:pPr/>
+            <w:r/>
+            <w:r>
+              <w:rPr>
+                <w:rFonts w:ascii="Calibri" w:hAnsi="Calibri"/>
+                <w:b w:val="0"/>
+                <w:sz w:val="19"/>
+              </w:rPr>
+              <w:t>int numFactura</w:t>
+            </w:r>
+          </w:p>
+        </w:tc>
+        <w:tc>
+          <w:tcPr>
+            <w:tcW w:type="dxa" w:w="1884"/>
+          </w:tcPr>
+          <w:p>
+            <w:pPr/>
+            <w:r/>
+            <w:r>
+              <w:rPr>
+                <w:rFonts w:ascii="Calibri" w:hAnsi="Calibri"/>
+                <w:b w:val="0"/>
+                <w:sz w:val="19"/>
+              </w:rPr>
+              <w:t>List&lt;CuotaAmortizacion&gt;</w:t>
+            </w:r>
+          </w:p>
+        </w:tc>
+        <w:tc>
+          <w:tcPr>
+            <w:tcW w:type="dxa" w:w="2450"/>
+          </w:tcPr>
+          <w:p>
+            <w:pPr/>
+            <w:r/>
+            <w:r>
+              <w:rPr>
+                <w:rFonts w:ascii="Calibri" w:hAnsi="Calibri"/>
+                <w:b w:val="0"/>
+                <w:sz w:val="19"/>
+              </w:rPr>
+              <w:t>Obtiene del Core BanQuito la tabla de amortización del crédito asociado a la factura (Read).</w:t>
+            </w:r>
+          </w:p>
+        </w:tc>
+      </w:tr>
+      <w:tr>
+        <w:tc>
+          <w:tcPr>
+            <w:tcW w:type="dxa" w:w="2260"/>
+          </w:tcPr>
+          <w:p>
+            <w:pPr/>
+            <w:r/>
+            <w:r>
+              <w:rPr>
+                <w:rFonts w:ascii="Calibri" w:hAnsi="Calibri"/>
+                <w:b w:val="0"/>
+                <w:sz w:val="19"/>
+              </w:rPr>
+              <w:t>obtenerFactura</w:t>
+            </w:r>
+          </w:p>
+        </w:tc>
+        <w:tc>
+          <w:tcPr>
+            <w:tcW w:type="dxa" w:w="2826"/>
+          </w:tcPr>
+          <w:p>
+            <w:pPr/>
+            <w:r/>
+            <w:r>
+              <w:rPr>
+                <w:rFonts w:ascii="Calibri" w:hAnsi="Calibri"/>
+                <w:b w:val="0"/>
+                <w:sz w:val="19"/>
+              </w:rPr>
+              <w:t>int numFactura</w:t>
+            </w:r>
+          </w:p>
+        </w:tc>
+        <w:tc>
+          <w:tcPr>
+            <w:tcW w:type="dxa" w:w="1884"/>
+          </w:tcPr>
+          <w:p>
+            <w:pPr/>
+            <w:r/>
+            <w:r>
+              <w:rPr>
+                <w:rFonts w:ascii="Calibri" w:hAnsi="Calibri"/>
+                <w:b w:val="0"/>
+                <w:sz w:val="19"/>
+              </w:rPr>
+              <w:t>Factura</w:t>
+            </w:r>
+          </w:p>
+        </w:tc>
+        <w:tc>
+          <w:tcPr>
+            <w:tcW w:type="dxa" w:w="2450"/>
+          </w:tcPr>
+          <w:p>
+            <w:pPr/>
+            <w:r/>
+            <w:r>
+              <w:rPr>
+                <w:rFonts w:ascii="Calibri" w:hAnsi="Calibri"/>
+                <w:b w:val="0"/>
+                <w:sz w:val="19"/>
+              </w:rPr>
+              <w:t>Operación Read (R): consulta los datos de cabecera y detalle de una factura emitida por su número.</w:t>
             </w:r>
           </w:p>
         </w:tc>
@@ -33068,18 +33062,15 @@
             </w:tcMar>
           </w:tcPr>
           <w:p>
-            <w:pPr>
-              <w:spacing w:before="0" w:after="0"/>
-              <w:jc w:val="left"/>
-            </w:pPr>
-            <w:r>
-              <w:rPr>
-                <w:rFonts w:ascii="Calibri" w:hAnsi="Calibri" w:cs="Calibri"/>
-                <w:b/>
-                <w:color w:val="000000"/>
-                <w:sz w:val="19"/>
-              </w:rPr>
-              <w:t xml:space="preserve">RF-05</w:t>
+            <w:pPr/>
+            <w:r/>
+            <w:r>
+              <w:rPr>
+                <w:rFonts w:ascii="Calibri" w:hAnsi="Calibri"/>
+                <w:b w:val="0"/>
+                <w:sz w:val="19"/>
+              </w:rPr>
+              <w:t>RF-05</w:t>
             </w:r>
           </w:p>
         </w:tc>
@@ -33095,18 +33086,15 @@
             </w:tcMar>
           </w:tcPr>
           <w:p>
-            <w:pPr>
-              <w:spacing w:before="0" w:after="0"/>
-              <w:jc w:val="left"/>
-            </w:pPr>
-            <w:r>
-              <w:rPr>
-                <w:rFonts w:ascii="Calibri" w:hAnsi="Calibri" w:cs="Calibri"/>
+            <w:pPr/>
+            <w:r/>
+            <w:r>
+              <w:rPr>
+                <w:rFonts w:ascii="Calibri" w:hAnsi="Calibri"/>
                 <w:b w:val="0"/>
-                <w:color w:val="000000"/>
-                <w:sz w:val="19"/>
-              </w:rPr>
-              <w:t xml:space="preserve">CU-05</w:t>
+                <w:sz w:val="19"/>
+              </w:rPr>
+              <w:t>CU-05</w:t>
             </w:r>
           </w:p>
         </w:tc>
@@ -33122,18 +33110,15 @@
             </w:tcMar>
           </w:tcPr>
           <w:p>
-            <w:pPr>
-              <w:spacing w:before="0" w:after="0"/>
-              <w:jc w:val="left"/>
-            </w:pPr>
-            <w:r>
-              <w:rPr>
-                <w:rFonts w:ascii="Calibri" w:hAnsi="Calibri" w:cs="Calibri"/>
+            <w:pPr/>
+            <w:r/>
+            <w:r>
+              <w:rPr>
+                <w:rFonts w:ascii="Calibri" w:hAnsi="Calibri"/>
                 <w:b w:val="0"/>
-                <w:color w:val="000000"/>
-                <w:sz w:val="19"/>
-              </w:rPr>
-              <w:t xml:space="preserve">listar / guardar / eliminarCelular()</w:t>
+                <w:sz w:val="19"/>
+              </w:rPr>
+              <w:t>crearCelular(), listarCelulares(), obtenerCelular(), actualizarCelular(), eliminarCelular()</w:t>
             </w:r>
           </w:p>
         </w:tc>
@@ -33149,18 +33134,15 @@
             </w:tcMar>
           </w:tcPr>
           <w:p>
-            <w:pPr>
-              <w:spacing w:before="0" w:after="0"/>
-              <w:jc w:val="left"/>
-            </w:pPr>
-            <w:r>
-              <w:rPr>
-                <w:rFonts w:ascii="Calibri" w:hAnsi="Calibri" w:cs="Calibri"/>
+            <w:pPr/>
+            <w:r/>
+            <w:r>
+              <w:rPr>
+                <w:rFonts w:ascii="Calibri" w:hAnsi="Calibri"/>
                 <w:b w:val="0"/>
-                <w:color w:val="000000"/>
-                <w:sz w:val="19"/>
-              </w:rPr>
-              <w:t xml:space="preserve">WS_Comercializadora_SOAP</w:t>
+                <w:sz w:val="19"/>
+              </w:rPr>
+              <w:t>WS_Comercializadora_SOAP</w:t>
             </w:r>
           </w:p>
         </w:tc>
@@ -33176,18 +33158,15 @@
             </w:tcMar>
           </w:tcPr>
           <w:p>
-            <w:pPr>
-              <w:spacing w:before="0" w:after="0"/>
-              <w:jc w:val="left"/>
-            </w:pPr>
-            <w:r>
-              <w:rPr>
-                <w:rFonts w:ascii="Calibri" w:hAnsi="Calibri" w:cs="Calibri"/>
+            <w:pPr/>
+            <w:r/>
+            <w:r>
+              <w:rPr>
+                <w:rFonts w:ascii="Calibri" w:hAnsi="Calibri"/>
                 <w:b w:val="0"/>
-                <w:color w:val="000000"/>
-                <w:sz w:val="19"/>
-              </w:rPr>
-              <w:t xml:space="preserve">Catálogo actualizado en los clientes.</w:t>
+                <w:sz w:val="19"/>
+              </w:rPr>
+              <w:t>Operaciones CRUD completas del catálogo operativas y reflejadas en los cuatro clientes (Consola, Swing, JSP y Android).</w:t>
             </w:r>
           </w:p>
         </w:tc>
@@ -33488,18 +33467,15 @@
             </w:tcMar>
           </w:tcPr>
           <w:p>
-            <w:pPr>
-              <w:spacing w:before="0" w:after="0"/>
-              <w:jc w:val="left"/>
-            </w:pPr>
-            <w:r>
-              <w:rPr>
-                <w:rFonts w:ascii="Calibri" w:hAnsi="Calibri" w:cs="Calibri"/>
-                <w:b/>
-                <w:color w:val="000000"/>
-                <w:sz w:val="19"/>
-              </w:rPr>
-              <w:t xml:space="preserve">RF-08 / RNF-007</w:t>
+            <w:pPr/>
+            <w:r/>
+            <w:r>
+              <w:rPr>
+                <w:rFonts w:ascii="Calibri" w:hAnsi="Calibri"/>
+                <w:b w:val="0"/>
+                <w:sz w:val="19"/>
+              </w:rPr>
+              <w:t>RF-08 / RNF-007</w:t>
             </w:r>
           </w:p>
         </w:tc>
@@ -33515,18 +33491,15 @@
             </w:tcMar>
           </w:tcPr>
           <w:p>
-            <w:pPr>
-              <w:spacing w:before="0" w:after="0"/>
-              <w:jc w:val="left"/>
-            </w:pPr>
-            <w:r>
-              <w:rPr>
-                <w:rFonts w:ascii="Calibri" w:hAnsi="Calibri" w:cs="Calibri"/>
+            <w:pPr/>
+            <w:r/>
+            <w:r>
+              <w:rPr>
+                <w:rFonts w:ascii="Calibri" w:hAnsi="Calibri"/>
                 <w:b w:val="0"/>
-                <w:color w:val="000000"/>
-                <w:sz w:val="19"/>
-              </w:rPr>
-              <w:t xml:space="preserve">CU-08</w:t>
+                <w:sz w:val="19"/>
+              </w:rPr>
+              <w:t>CU-08</w:t>
             </w:r>
           </w:p>
         </w:tc>
@@ -33542,18 +33515,15 @@
             </w:tcMar>
           </w:tcPr>
           <w:p>
-            <w:pPr>
-              <w:spacing w:before="0" w:after="0"/>
-              <w:jc w:val="left"/>
-            </w:pPr>
-            <w:r>
-              <w:rPr>
-                <w:rFonts w:ascii="Calibri" w:hAnsi="Calibri" w:cs="Calibri"/>
+            <w:pPr/>
+            <w:r/>
+            <w:r>
+              <w:rPr>
+                <w:rFonts w:ascii="Calibri" w:hAnsi="Calibri"/>
                 <w:b w:val="0"/>
-                <w:color w:val="000000"/>
-                <w:sz w:val="19"/>
-              </w:rPr>
-              <w:t xml:space="preserve">consultarAmortizacion()</w:t>
+                <w:sz w:val="19"/>
+              </w:rPr>
+              <w:t>consultarAmortizacion(), obtenerFactura()</w:t>
             </w:r>
           </w:p>
         </w:tc>
@@ -33569,18 +33539,15 @@
             </w:tcMar>
           </w:tcPr>
           <w:p>
-            <w:pPr>
-              <w:spacing w:before="0" w:after="0"/>
-              <w:jc w:val="left"/>
-            </w:pPr>
-            <w:r>
-              <w:rPr>
-                <w:rFonts w:ascii="Calibri" w:hAnsi="Calibri" w:cs="Calibri"/>
+            <w:pPr/>
+            <w:r/>
+            <w:r>
+              <w:rPr>
+                <w:rFonts w:ascii="Calibri" w:hAnsi="Calibri"/>
                 <w:b w:val="0"/>
-                <w:color w:val="000000"/>
-                <w:sz w:val="19"/>
-              </w:rPr>
-              <w:t xml:space="preserve">WS_Comercializadora_SOAP</w:t>
+                <w:sz w:val="19"/>
+              </w:rPr>
+              <w:t>WS_Comercializadora_SOAP</w:t>
             </w:r>
           </w:p>
         </w:tc>
@@ -33596,18 +33563,15 @@
             </w:tcMar>
           </w:tcPr>
           <w:p>
-            <w:pPr>
-              <w:spacing w:before="0" w:after="0"/>
-              <w:jc w:val="left"/>
-            </w:pPr>
-            <w:r>
-              <w:rPr>
-                <w:rFonts w:ascii="Calibri" w:hAnsi="Calibri" w:cs="Calibri"/>
+            <w:pPr/>
+            <w:r/>
+            <w:r>
+              <w:rPr>
+                <w:rFonts w:ascii="Calibri" w:hAnsi="Calibri"/>
                 <w:b w:val="0"/>
-                <w:color w:val="000000"/>
-                <w:sz w:val="19"/>
-              </w:rPr>
-              <w:t xml:space="preserve">Tabla mostrada en los cuatro clientes.</w:t>
+                <w:sz w:val="19"/>
+              </w:rPr>
+              <w:t>Factura y tabla de amortización mostradas en los cuatro clientes.</w:t>
             </w:r>
           </w:p>
         </w:tc>

</xml_diff>

<commit_message>
Cliente web y cliente movil
</commit_message>
<xml_diff>
--- a/01. UML/01. ERS/ERS_BANQUITO_SOAP_JAVA_CONBDD_GR08.docx
+++ b/01. UML/01. ERS/ERS_BANQUITO_SOAP_JAVA_CONBDD_GR08.docx
@@ -15934,7 +15934,7 @@
           <w:color w:val="000000"/>
           <w:sz w:val="22"/>
         </w:rPr>
-        <w:t xml:space="preserve">La comunicación se realiza exclusivamente por la red mediante HTTP. Los cuatro clientes y la comercializadora intercambian mensajes SOAP en formato XML de acuerdo con el contrato WSDL de cada servicio. Los errores se devuelven como SOAP Fault con un código y un mensaje descriptivo:</w:t>
+        <w:t>La comunicación se realiza exclusivamente por la red mediante HTTP. Los cuatro clientes y la comercializadora intercambian mensajes SOAP en formato XML de acuerdo con el contrato WSDL de cada servicio. Cada error se informa con un código y un mensaje descriptivo que inicia con ese código (por ejemplo, «CRE-001: El cliente no es sujeto de crédito: ya mantiene un crédito activo en BanQuito.»). El Core devuelve las reglas incumplidas en los campos motivo y mensaje de sus respuestas y las demás fallas como SOAP Fault; la comercializadora declara en su WSDL la falla ExcepcionComercializadora {codigo, message}, que reciben los cuatro clientes:</w:t>
       </w:r>
     </w:p>
     <w:p>
@@ -16344,7 +16344,7 @@
                 <w:color w:val="000000"/>
                 <w:sz w:val="19"/>
               </w:rPr>
-              <w:t xml:space="preserve">Parámetro nulo, vacío, no numérico o fuera de rango.</w:t>
+              <w:t>Parámetro nulo, vacío, no numérico, fuera de rango o cédula con dígito verificador incorrecto.</w:t>
             </w:r>
           </w:p>
         </w:tc>
@@ -21035,7 +21035,7 @@
                 <w:color w:val="000000"/>
                 <w:sz w:val="19"/>
               </w:rPr>
-              <w:t xml:space="preserve">Recibe el código de cliente, el precio del teléfono y el número de cuotas; si el precio es menor o igual al monto máximo, aprueba el crédito, calcula la cuota fija y registra el crédito con todas las cuotas de su tabla de amortización.</w:t>
+              <w:t>Recibe el código de cliente, el precio del teléfono y el número de cuotas; vuelve a aplicar las reglas de sujeto de crédito (RN-01 a RN-04) y, si el precio es menor o igual al monto máximo, aprueba el crédito, calcula la cuota fija y registra el crédito con todas las cuotas de su tabla de amortización.</w:t>
             </w:r>
           </w:p>
         </w:tc>
@@ -21981,14 +21981,8 @@
           </w:tcPr>
           <w:p>
             <w:pPr/>
-            <w:r/>
-            <w:r>
-              <w:rPr>
-                <w:rFonts w:ascii="Calibri" w:hAnsi="Calibri"/>
-                <w:b w:val="0"/>
-                <w:sz w:val="19"/>
-              </w:rPr>
-              <w:t>Permite al vendedor administrar el catálogo mediante operaciones CRUD: registrar nuevos teléfonos (Create), listar teléfonos activos y consultar por código (Read), modificar datos o reactivar/desactivar (Update) y eliminar o aplicar borrado lógico (Delete) conservando marca, modelo y precio.</w:t>
+            <w:r>
+              <w:t>Permite al vendedor administrar el catálogo mediante operaciones CRUD: registrar nuevos teléfonos (Create), listar el catálogo completo o solo los teléfonos activos y consultar por código (Read), modificar datos o reactivar/desactivar (Update) y eliminar o aplicar borrado lógico (Delete) conservando marca, modelo y precio.</w:t>
             </w:r>
           </w:p>
         </w:tc>
@@ -22475,7 +22469,7 @@
                 <w:color w:val="000000"/>
                 <w:sz w:val="19"/>
               </w:rPr>
-              <w:t xml:space="preserve">Registra la factura de la venta de un teléfono pagado en efectivo, aplicando un descuento del 42 % sobre el precio de venta.</w:t>
+              <w:t>Registra la factura de la venta de un teléfono pagado en efectivo, con la cantidad indicada, aplicando un descuento del 42 % sobre el precio de venta.</w:t>
             </w:r>
           </w:p>
         </w:tc>
@@ -23509,7 +23503,7 @@
                 <w:color w:val="000000"/>
                 <w:sz w:val="19"/>
               </w:rPr>
-              <w:t xml:space="preserve">A partir de una factura con crédito directo, obtiene del Core y muestra la tabla de amortización del préstamo del cliente.</w:t>
+              <w:t>A partir del número de una factura con crédito directo, obtiene del Core y muestra la tabla de amortización del préstamo del cliente.</w:t>
             </w:r>
           </w:p>
         </w:tc>
@@ -23804,7 +23798,7 @@
                 <w:color w:val="000000"/>
                 <w:sz w:val="19"/>
               </w:rPr>
-              <w:t xml:space="preserve">Disponible en los cuatro clientes.</w:t>
+              <w:t>Disponible en los cuatro clientes. Si la factura se pagó en efectivo, se informa que no tiene tabla de amortización (VAL-001).</w:t>
             </w:r>
           </w:p>
         </w:tc>
@@ -25781,7 +25775,7 @@
                 <w:color w:val="000000"/>
                 <w:sz w:val="19"/>
               </w:rPr>
-              <w:t xml:space="preserve">Los valores monetarios se almacenan como NUMERIC(10,2) y se calculan con BigDecimal redondeando a dos decimales (HALF_UP) en cada cuota; la última cuota ajusta el residuo para que el saldo final sea 0,00.</w:t>
+              <w:t>Los valores monetarios se almacenan como DECIMAL(12,2) (los precios del catálogo, como DECIMAL(10,2)) y se calculan con BigDecimal redondeando a dos decimales (HALF_UP) en cada cuota; la última cuota ajusta el residuo para que el saldo final sea 0,00.</w:t>
             </w:r>
           </w:p>
         </w:tc>
@@ -28605,7 +28599,7 @@
                 <w:color w:val="000000"/>
                 <w:sz w:val="19"/>
               </w:rPr>
-              <w:t xml:space="preserve">RespuestaCredito {codCredito, cuota, tabla}</w:t>
+              <w:t>RespuestaCredito {exito, codCredito, valorCuota, mensaje, amortizacion}</w:t>
             </w:r>
           </w:p>
         </w:tc>
@@ -28632,7 +28626,7 @@
                 <w:color w:val="000000"/>
                 <w:sz w:val="19"/>
               </w:rPr>
-              <w:t xml:space="preserve">Aprueba el crédito y registra la tabla de amortización.</w:t>
+              <w:t>Vuelve a validar al cliente, aprueba el crédito y registra la tabla de amortización.</w:t>
             </w:r>
           </w:p>
         </w:tc>
@@ -29111,6 +29105,24 @@
           </w:tcPr>
           <w:p>
             <w:pPr/>
+            <w:r>
+              <w:t>boolean soloActivos</w:t>
+            </w:r>
+          </w:p>
+        </w:tc>
+        <w:tc>
+          <w:tcPr>
+            <w:tcW w:w="1884" w:type="dxa"/>
+            <w:shd w:val="clear" w:color="auto" w:fill="FFFFFF"/>
+            <w:tcMar>
+              <w:top w:w="80" w:type="dxa"/>
+              <w:bottom w:w="80" w:type="dxa"/>
+              <w:left w:w="120" w:type="dxa"/>
+              <w:right w:w="120" w:type="dxa"/>
+            </w:tcMar>
+          </w:tcPr>
+          <w:p>
+            <w:pPr/>
             <w:r/>
             <w:r>
               <w:rPr>
@@ -29118,30 +29130,6 @@
                 <w:b w:val="0"/>
                 <w:sz w:val="19"/>
               </w:rPr>
-              <w:t>—</w:t>
-            </w:r>
-          </w:p>
-        </w:tc>
-        <w:tc>
-          <w:tcPr>
-            <w:tcW w:w="1884" w:type="dxa"/>
-            <w:shd w:val="clear" w:color="auto" w:fill="FFFFFF"/>
-            <w:tcMar>
-              <w:top w:w="80" w:type="dxa"/>
-              <w:bottom w:w="80" w:type="dxa"/>
-              <w:left w:w="120" w:type="dxa"/>
-              <w:right w:w="120" w:type="dxa"/>
-            </w:tcMar>
-          </w:tcPr>
-          <w:p>
-            <w:pPr/>
-            <w:r/>
-            <w:r>
-              <w:rPr>
-                <w:rFonts w:ascii="Calibri" w:hAnsi="Calibri"/>
-                <w:b w:val="0"/>
-                <w:sz w:val="19"/>
-              </w:rPr>
               <w:t>List&lt;Celular&gt;</w:t>
             </w:r>
           </w:p>
@@ -29159,14 +29147,8 @@
           </w:tcPr>
           <w:p>
             <w:pPr/>
-            <w:r/>
-            <w:r>
-              <w:rPr>
-                <w:rFonts w:ascii="Calibri" w:hAnsi="Calibri"/>
-                <w:b w:val="0"/>
-                <w:sz w:val="19"/>
-              </w:rPr>
-              <w:t>Operación Read (R): retorna la lista de todos los teléfonos celulares activos en el catálogo.</w:t>
+            <w:r>
+              <w:t>Operación Read (R): retorna los teléfonos del catálogo; con soloActivos = true, solo los disponibles para la venta.</w:t>
             </w:r>
           </w:p>
         </w:tc>
@@ -29515,6 +29497,24 @@
           </w:tcPr>
           <w:p>
             <w:pPr/>
+            <w:r>
+              <w:t>String cedula, String nombre, int codCelular, int cantidad</w:t>
+            </w:r>
+          </w:p>
+        </w:tc>
+        <w:tc>
+          <w:tcPr>
+            <w:tcW w:w="1884" w:type="dxa"/>
+            <w:shd w:val="clear" w:color="auto" w:fill="FFFFFF"/>
+            <w:tcMar>
+              <w:top w:w="80" w:type="dxa"/>
+              <w:bottom w:w="80" w:type="dxa"/>
+              <w:left w:w="120" w:type="dxa"/>
+              <w:right w:w="120" w:type="dxa"/>
+            </w:tcMar>
+          </w:tcPr>
+          <w:p>
+            <w:pPr/>
             <w:r/>
             <w:r>
               <w:rPr>
@@ -29522,30 +29522,6 @@
                 <w:b w:val="0"/>
                 <w:sz w:val="19"/>
               </w:rPr>
-              <w:t>String cedula, String nombre, int codCelular</w:t>
-            </w:r>
-          </w:p>
-        </w:tc>
-        <w:tc>
-          <w:tcPr>
-            <w:tcW w:w="1884" w:type="dxa"/>
-            <w:shd w:val="clear" w:color="auto" w:fill="FFFFFF"/>
-            <w:tcMar>
-              <w:top w:w="80" w:type="dxa"/>
-              <w:bottom w:w="80" w:type="dxa"/>
-              <w:left w:w="120" w:type="dxa"/>
-              <w:right w:w="120" w:type="dxa"/>
-            </w:tcMar>
-          </w:tcPr>
-          <w:p>
-            <w:pPr/>
-            <w:r/>
-            <w:r>
-              <w:rPr>
-                <w:rFonts w:ascii="Calibri" w:hAnsi="Calibri"/>
-                <w:b w:val="0"/>
-                <w:sz w:val="19"/>
-              </w:rPr>
               <w:t>Factura</w:t>
             </w:r>
           </w:p>
@@ -29563,14 +29539,8 @@
           </w:tcPr>
           <w:p>
             <w:pPr/>
-            <w:r/>
-            <w:r>
-              <w:rPr>
-                <w:rFonts w:ascii="Calibri" w:hAnsi="Calibri"/>
-                <w:b w:val="0"/>
-                <w:sz w:val="19"/>
-              </w:rPr>
-              <w:t>Registra la venta con pago en efectivo aplicando un 42 % de descuento sobre el precio de lista (Create).</w:t>
+            <w:r>
+              <w:t>Registra la venta con pago en efectivo de la cantidad indicada, aplicando un 42 % de descuento sobre el precio de lista (Create).</w:t>
             </w:r>
           </w:p>
         </w:tc>

</xml_diff>